<commit_message>
Data - 12/7/2025 - part 2
</commit_message>
<xml_diff>
--- a/Data/Private Data/Data Collections - 12-7-2025.docx
+++ b/Data/Private Data/Data Collections - 12-7-2025.docx
@@ -12,17 +12,17 @@
     </w:p>
     <w:p>
       <w:r>
-        <w:t>Total Tables: 90</w:t>
+        <w:t>Total Tables: 91</w:t>
       </w:r>
     </w:p>
     <w:p>
       <w:r>
-        <w:t>Total Rows: 4475</w:t>
+        <w:t>Total Rows: 4495</w:t>
       </w:r>
     </w:p>
     <w:p>
       <w:r>
-        <w:t>Total Columns: 1391</w:t>
+        <w:t>Total Columns: 1406</w:t>
       </w:r>
     </w:p>
     <w:p>
@@ -130,7 +130,7 @@
           <w:b w:val="0"/>
           <w:sz w:val="16"/>
         </w:rPr>
-        <w:t>7 x 9</w:t>
+        <w:t>8 x 9</w:t>
       </w:r>
       <w:r>
         <w:rPr>
@@ -194,7 +194,7 @@
           <w:b w:val="0"/>
           <w:sz w:val="20"/>
         </w:rPr>
-        <w:t>85 x 16</w:t>
+        <w:t>86 x 16</w:t>
       </w:r>
       <w:r>
         <w:rPr>
@@ -679,7 +679,7 @@
           <w:b w:val="0"/>
           <w:sz w:val="20"/>
         </w:rPr>
-        <w:t>130 x 15</w:t>
+        <w:t>131 x 15</w:t>
       </w:r>
       <w:r>
         <w:rPr>
@@ -1227,6 +1227,57 @@
     </w:p>
     <w:p>
       <w:r>
+        <w:rPr>
+          <w:b/>
+          <w:sz w:val="16"/>
+        </w:rPr>
+        <w:t xml:space="preserve">Data Path: </w:t>
+      </w:r>
+      <w:r>
+        <w:rPr>
+          <w:b w:val="0"/>
+          <w:sz w:val="16"/>
+        </w:rPr>
+        <w:t xml:space="preserve">6-Content Storage Folder -&gt; </w:t>
+      </w:r>
+      <w:r>
+        <w:rPr>
+          <w:b w:val="0"/>
+          <w:sz w:val="16"/>
+        </w:rPr>
+        <w:t xml:space="preserve">1-ContentStorage Database -&gt; </w:t>
+      </w:r>
+      <w:r>
+        <w:rPr>
+          <w:b/>
+          <w:sz w:val="16"/>
+        </w:rPr>
+        <w:t xml:space="preserve">3-FolderHistory Table </w:t>
+      </w:r>
+      <w:r>
+        <w:rPr>
+          <w:b/>
+          <w:sz w:val="16"/>
+        </w:rPr>
+        <w:t xml:space="preserve">[Rows x Columns: </w:t>
+      </w:r>
+      <w:r>
+        <w:rPr>
+          <w:b w:val="0"/>
+          <w:sz w:val="16"/>
+        </w:rPr>
+        <w:t>1 x 15</w:t>
+      </w:r>
+      <w:r>
+        <w:rPr>
+          <w:b/>
+          <w:sz w:val="16"/>
+        </w:rPr>
+        <w:t>]</w:t>
+      </w:r>
+    </w:p>
+    <w:p>
+      <w:r>
         <w:br/>
       </w:r>
     </w:p>
@@ -1330,7 +1381,7 @@
           <w:b w:val="0"/>
           <w:sz w:val="18"/>
         </w:rPr>
-        <w:t>261 x 26</w:t>
+        <w:t>269 x 26</w:t>
       </w:r>
       <w:r>
         <w:rPr>
@@ -4265,7 +4316,7 @@
           <w:b w:val="0"/>
           <w:sz w:val="16"/>
         </w:rPr>
-        <w:t>1 x 17</w:t>
+        <w:t>2 x 17</w:t>
       </w:r>
       <w:r>
         <w:rPr>
@@ -4316,7 +4367,7 @@
           <w:b w:val="0"/>
           <w:sz w:val="16"/>
         </w:rPr>
-        <w:t>7 x 18</w:t>
+        <w:t>14 x 18</w:t>
       </w:r>
       <w:r>
         <w:rPr>

</xml_diff>